<commit_message>
fix: changes to week 3 and week 4
</commit_message>
<xml_diff>
--- a/Week 3-Use Case Tables.docx
+++ b/Week 3-Use Case Tables.docx
@@ -4180,14 +4180,27 @@
               <w:rPr>
                 <w:sz w:val="19"/>
               </w:rPr>
-              <w:t>1. The tenant logs into the system.</w:t>
+              <w:t>1. The tenant logs in.</w:t>
             </w:r>
             <w:r>
               <w:rPr>
                 <w:sz w:val="19"/>
               </w:rPr>
               <w:br/>
-              <w:t>2. The system shows the inbox or notification for new messages.</w:t>
+              <w:t xml:space="preserve">2. The </w:t>
+            </w:r>
+            <w:r>
+              <w:rPr>
+                <w:sz w:val="19"/>
+                <w:lang w:val="en-DE"/>
+              </w:rPr>
+              <w:t>tenant opens inbox/notifications</w:t>
+            </w:r>
+            <w:r>
+              <w:rPr>
+                <w:sz w:val="19"/>
+              </w:rPr>
+              <w:t>.</w:t>
             </w:r>
             <w:r>
               <w:rPr>
@@ -4201,7 +4214,33 @@
                 <w:sz w:val="19"/>
               </w:rPr>
               <w:br/>
-              <w:t>4. The system displays the received message content.</w:t>
+              <w:t xml:space="preserve">4. The </w:t>
+            </w:r>
+            <w:r>
+              <w:rPr>
+                <w:sz w:val="19"/>
+                <w:lang w:val="en-DE"/>
+              </w:rPr>
+              <w:t>tenant</w:t>
+            </w:r>
+            <w:r>
+              <w:rPr>
+                <w:sz w:val="19"/>
+              </w:rPr>
+              <w:t xml:space="preserve"> </w:t>
+            </w:r>
+            <w:r>
+              <w:rPr>
+                <w:sz w:val="19"/>
+                <w:lang w:val="en-DE"/>
+              </w:rPr>
+              <w:t xml:space="preserve">checks </w:t>
+            </w:r>
+            <w:r>
+              <w:rPr>
+                <w:sz w:val="19"/>
+              </w:rPr>
+              <w:t>the received message content.</w:t>
             </w:r>
           </w:p>
         </w:tc>
@@ -4254,7 +4293,20 @@
               <w:rPr>
                 <w:sz w:val="19"/>
               </w:rPr>
-              <w:t>1. If there are no new messages, the system shows the current conversation history or an empty inbox message.</w:t>
+              <w:t xml:space="preserve">1. If there are no new messages, the </w:t>
+            </w:r>
+            <w:r>
+              <w:rPr>
+                <w:sz w:val="19"/>
+                <w:lang w:val="en-DE"/>
+              </w:rPr>
+              <w:t>tenant sees</w:t>
+            </w:r>
+            <w:r>
+              <w:rPr>
+                <w:sz w:val="19"/>
+              </w:rPr>
+              <w:t xml:space="preserve"> the current conversation history or an empty inbox message.</w:t>
             </w:r>
           </w:p>
         </w:tc>
@@ -5358,6 +5410,7 @@
                 <w:rFonts w:asciiTheme="majorHAnsi" w:hAnsiTheme="majorHAnsi" w:cstheme="majorHAnsi"/>
                 <w:sz w:val="19"/>
                 <w:szCs w:val="19"/>
+                <w:lang w:val="en-DE"/>
               </w:rPr>
             </w:pPr>
             <w:r>
@@ -5393,16 +5446,59 @@
                 <w:szCs w:val="19"/>
               </w:rPr>
               <w:br/>
-              <w:t xml:space="preserve">4. The system stores the selected property in the tenant’s favorites list. </w:t>
+              <w:t xml:space="preserve">4. The </w:t>
             </w:r>
             <w:r>
               <w:rPr>
                 <w:rFonts w:asciiTheme="majorHAnsi" w:hAnsiTheme="majorHAnsi" w:cstheme="majorHAnsi"/>
                 <w:sz w:val="19"/>
                 <w:szCs w:val="19"/>
+                <w:lang w:val="en-DE"/>
+              </w:rPr>
+              <w:t>tenant</w:t>
+            </w:r>
+            <w:r>
+              <w:rPr>
+                <w:rFonts w:asciiTheme="majorHAnsi" w:hAnsiTheme="majorHAnsi" w:cstheme="majorHAnsi"/>
+                <w:sz w:val="19"/>
+                <w:szCs w:val="19"/>
+              </w:rPr>
+              <w:t xml:space="preserve"> stores the selected property. </w:t>
+            </w:r>
+            <w:r>
+              <w:rPr>
+                <w:rFonts w:asciiTheme="majorHAnsi" w:hAnsiTheme="majorHAnsi" w:cstheme="majorHAnsi"/>
+                <w:sz w:val="19"/>
+                <w:szCs w:val="19"/>
               </w:rPr>
               <w:br/>
-              <w:t>5. The system confirms that the property has been saved.</w:t>
+              <w:t xml:space="preserve">5. The </w:t>
+            </w:r>
+            <w:r>
+              <w:rPr>
+                <w:rFonts w:asciiTheme="majorHAnsi" w:hAnsiTheme="majorHAnsi" w:cstheme="majorHAnsi"/>
+                <w:sz w:val="19"/>
+                <w:szCs w:val="19"/>
+                <w:lang w:val="en-DE"/>
+              </w:rPr>
+              <w:t>tenant</w:t>
+            </w:r>
+            <w:r>
+              <w:rPr>
+                <w:rFonts w:asciiTheme="majorHAnsi" w:hAnsiTheme="majorHAnsi" w:cstheme="majorHAnsi"/>
+                <w:sz w:val="19"/>
+                <w:szCs w:val="19"/>
+              </w:rPr>
+              <w:t xml:space="preserve"> </w:t>
+            </w:r>
+            <w:r>
+              <w:rPr>
+                <w:rFonts w:asciiTheme="majorHAnsi" w:hAnsiTheme="majorHAnsi" w:cstheme="majorHAnsi"/>
+                <w:sz w:val="19"/>
+                <w:szCs w:val="19"/>
+                <w:lang w:val="en-DE"/>
+              </w:rPr>
+              <w:t>saves the property.</w:t>
             </w:r>
           </w:p>
         </w:tc>
@@ -5469,7 +5565,41 @@
                 <w:sz w:val="19"/>
                 <w:szCs w:val="19"/>
               </w:rPr>
-              <w:t>1. If the property is already saved in favorites, the system informs the tenant that the property is already in the favorites list.</w:t>
+              <w:t xml:space="preserve">1. If the property is already saved in favorites, the </w:t>
+            </w:r>
+            <w:r>
+              <w:rPr>
+                <w:rFonts w:asciiTheme="majorHAnsi" w:hAnsiTheme="majorHAnsi" w:cstheme="majorHAnsi"/>
+                <w:sz w:val="19"/>
+                <w:szCs w:val="19"/>
+                <w:lang w:val="en-DE"/>
+              </w:rPr>
+              <w:t>tenant</w:t>
+            </w:r>
+            <w:r>
+              <w:rPr>
+                <w:rFonts w:asciiTheme="majorHAnsi" w:hAnsiTheme="majorHAnsi" w:cstheme="majorHAnsi"/>
+                <w:sz w:val="19"/>
+                <w:szCs w:val="19"/>
+              </w:rPr>
+              <w:t xml:space="preserve"> </w:t>
+            </w:r>
+            <w:r>
+              <w:rPr>
+                <w:rFonts w:asciiTheme="majorHAnsi" w:hAnsiTheme="majorHAnsi" w:cstheme="majorHAnsi"/>
+                <w:sz w:val="19"/>
+                <w:szCs w:val="19"/>
+                <w:lang w:val="en-DE"/>
+              </w:rPr>
+              <w:t>sees</w:t>
+            </w:r>
+            <w:r>
+              <w:rPr>
+                <w:rFonts w:asciiTheme="majorHAnsi" w:hAnsiTheme="majorHAnsi" w:cstheme="majorHAnsi"/>
+                <w:sz w:val="19"/>
+                <w:szCs w:val="19"/>
+              </w:rPr>
+              <w:t xml:space="preserve"> that the property is already in the favorites list.</w:t>
             </w:r>
           </w:p>
         </w:tc>
@@ -6121,7 +6251,22 @@
                 <w:szCs w:val="19"/>
               </w:rPr>
               <w:br/>
-              <w:t>6. The system saves and publishes the review for other users to see.</w:t>
+              <w:t xml:space="preserve">6. The </w:t>
+            </w:r>
+            <w:r>
+              <w:rPr>
+                <w:sz w:val="19"/>
+                <w:szCs w:val="19"/>
+                <w:lang w:val="en-DE"/>
+              </w:rPr>
+              <w:t>tenant</w:t>
+            </w:r>
+            <w:r>
+              <w:rPr>
+                <w:sz w:val="19"/>
+                <w:szCs w:val="19"/>
+              </w:rPr>
+              <w:t xml:space="preserve"> saves and publishes the review for other users to see.</w:t>
             </w:r>
           </w:p>
         </w:tc>
@@ -6187,7 +6332,22 @@
                 <w:sz w:val="19"/>
                 <w:szCs w:val="19"/>
               </w:rPr>
-              <w:t>1. If the tenant has not completed a rental for the property, the system prevents the review from being submitted.</w:t>
+              <w:t xml:space="preserve">1. If the tenant has not completed a rental for the property, </w:t>
+            </w:r>
+            <w:r>
+              <w:rPr>
+                <w:sz w:val="19"/>
+                <w:szCs w:val="19"/>
+                <w:lang w:val="en-DE"/>
+              </w:rPr>
+              <w:t>he</w:t>
+            </w:r>
+            <w:r>
+              <w:rPr>
+                <w:sz w:val="19"/>
+                <w:szCs w:val="19"/>
+              </w:rPr>
+              <w:t xml:space="preserve"> prevents the review from being submitted.</w:t>
             </w:r>
           </w:p>
         </w:tc>
@@ -7639,7 +7799,7 @@
               <w:rPr>
                 <w:sz w:val="19"/>
               </w:rPr>
-              <w:t>1. The property owner logs into the system.</w:t>
+              <w:t>1. The property owner logs in.</w:t>
             </w:r>
             <w:r>
               <w:rPr>
@@ -7660,7 +7820,20 @@
                 <w:sz w:val="19"/>
               </w:rPr>
               <w:br/>
-              <w:t>4. The system uploads and attaches the images to the property listing.</w:t>
+              <w:t xml:space="preserve">4. The </w:t>
+            </w:r>
+            <w:r>
+              <w:rPr>
+                <w:sz w:val="19"/>
+                <w:lang w:val="en-DE"/>
+              </w:rPr>
+              <w:t>property owner</w:t>
+            </w:r>
+            <w:r>
+              <w:rPr>
+                <w:sz w:val="19"/>
+              </w:rPr>
+              <w:t xml:space="preserve"> uploads and attaches the images to the property listing.</w:t>
             </w:r>
           </w:p>
         </w:tc>
@@ -9113,7 +9286,20 @@
                 <w:sz w:val="19"/>
               </w:rPr>
               <w:br/>
-              <w:t>3. The system retrieves pending and processed requests for the owner’s properties.</w:t>
+              <w:t xml:space="preserve">3. The </w:t>
+            </w:r>
+            <w:r>
+              <w:rPr>
+                <w:sz w:val="19"/>
+                <w:lang w:val="en-DE"/>
+              </w:rPr>
+              <w:t>property owner views pending request</w:t>
+            </w:r>
+            <w:r>
+              <w:rPr>
+                <w:sz w:val="19"/>
+              </w:rPr>
+              <w:t>.</w:t>
             </w:r>
             <w:r>
               <w:rPr>
@@ -9604,7 +9790,20 @@
               <w:rPr>
                 <w:sz w:val="19"/>
               </w:rPr>
-              <w:t>1. The property owner logs into the system.</w:t>
+              <w:t>1. The property owner log</w:t>
+            </w:r>
+            <w:r>
+              <w:rPr>
+                <w:sz w:val="19"/>
+                <w:lang w:val="en-DE"/>
+              </w:rPr>
+              <w:t>s</w:t>
+            </w:r>
+            <w:r>
+              <w:rPr>
+                <w:sz w:val="19"/>
+              </w:rPr>
+              <w:t xml:space="preserve"> into the system.</w:t>
             </w:r>
             <w:r>
               <w:rPr>
@@ -9632,14 +9831,40 @@
                 <w:sz w:val="19"/>
               </w:rPr>
               <w:br/>
-              <w:t>5. The system updates the request status.</w:t>
+              <w:t xml:space="preserve">5. The </w:t>
+            </w:r>
+            <w:r>
+              <w:rPr>
+                <w:sz w:val="19"/>
+                <w:lang w:val="en-DE"/>
+              </w:rPr>
+              <w:t>property owner</w:t>
+            </w:r>
+            <w:r>
+              <w:rPr>
+                <w:sz w:val="19"/>
+              </w:rPr>
+              <w:t xml:space="preserve"> updates the request status.</w:t>
             </w:r>
             <w:r>
               <w:rPr>
                 <w:sz w:val="19"/>
               </w:rPr>
               <w:br/>
-              <w:t>6. The system notifies the tenant about the decision.</w:t>
+              <w:t xml:space="preserve">6. The </w:t>
+            </w:r>
+            <w:r>
+              <w:rPr>
+                <w:sz w:val="19"/>
+                <w:lang w:val="en-DE"/>
+              </w:rPr>
+              <w:t>property owner</w:t>
+            </w:r>
+            <w:r>
+              <w:rPr>
+                <w:sz w:val="19"/>
+              </w:rPr>
+              <w:t xml:space="preserve"> notifies the tenant about the decision.</w:t>
             </w:r>
           </w:p>
         </w:tc>
@@ -10147,7 +10372,20 @@
                 <w:sz w:val="19"/>
               </w:rPr>
               <w:br/>
-              <w:t>5. The system stores and delivers the message to the tenant.</w:t>
+              <w:t xml:space="preserve">5. The </w:t>
+            </w:r>
+            <w:r>
+              <w:rPr>
+                <w:sz w:val="19"/>
+                <w:lang w:val="en-DE"/>
+              </w:rPr>
+              <w:t>property owner</w:t>
+            </w:r>
+            <w:r>
+              <w:rPr>
+                <w:sz w:val="19"/>
+              </w:rPr>
+              <w:t xml:space="preserve"> stores and delivers the message to the tenant.</w:t>
             </w:r>
           </w:p>
         </w:tc>
@@ -13853,6 +14091,50 @@
               <w:t>Take down listings that violate rules or platform standards.</w:t>
             </w:r>
           </w:p>
+          <w:tbl>
+            <w:tblPr>
+              <w:tblW w:w="0" w:type="auto"/>
+              <w:tblCellSpacing w:w="15" w:type="dxa"/>
+              <w:tblCellMar>
+                <w:top w:w="15" w:type="dxa"/>
+                <w:left w:w="15" w:type="dxa"/>
+                <w:bottom w:w="15" w:type="dxa"/>
+                <w:right w:w="15" w:type="dxa"/>
+              </w:tblCellMar>
+              <w:tblLook w:val="04A0" w:firstRow="1" w:lastRow="0" w:firstColumn="1" w:lastColumn="0" w:noHBand="0" w:noVBand="1"/>
+            </w:tblPr>
+            <w:tblGrid>
+              <w:gridCol w:w="96"/>
+            </w:tblGrid>
+            <w:tr>
+              <w:trPr>
+                <w:tblCellSpacing w:w="15" w:type="dxa"/>
+              </w:trPr>
+              <w:tc>
+                <w:tcPr>
+                  <w:tcW w:w="0" w:type="auto"/>
+                  <w:vAlign w:val="center"/>
+                  <w:hideMark/>
+                </w:tcPr>
+                <w:p>
+                  <w:pPr>
+                    <w:spacing w:after="0" w:line="240" w:lineRule="auto"/>
+                    <w:rPr>
+                      <w:rFonts w:asciiTheme="majorHAnsi" w:eastAsia="Times New Roman" w:hAnsiTheme="majorHAnsi" w:cstheme="majorHAnsi"/>
+                      <w:sz w:val="19"/>
+                      <w:szCs w:val="19"/>
+                      <w:lang w:val="en-GB" w:eastAsia="en-GB"/>
+                    </w:rPr>
+                  </w:pPr>
+                </w:p>
+              </w:tc>
+            </w:tr>
+          </w:tbl>
+          <w:p>
+            <w:pPr>
+              <w:spacing w:line="259" w:lineRule="auto"/>
+            </w:pPr>
+          </w:p>
         </w:tc>
       </w:tr>
       <w:tr>
@@ -13906,6 +14188,59 @@
               <w:t>The actor is authenticated when the function requires account access, and the relevant page or module is available to the actor.</w:t>
             </w:r>
           </w:p>
+          <w:tbl>
+            <w:tblPr>
+              <w:tblW w:w="0" w:type="auto"/>
+              <w:tblCellSpacing w:w="15" w:type="dxa"/>
+              <w:tblCellMar>
+                <w:top w:w="15" w:type="dxa"/>
+                <w:left w:w="15" w:type="dxa"/>
+                <w:bottom w:w="15" w:type="dxa"/>
+                <w:right w:w="15" w:type="dxa"/>
+              </w:tblCellMar>
+              <w:tblLook w:val="04A0" w:firstRow="1" w:lastRow="0" w:firstColumn="1" w:lastColumn="0" w:noHBand="0" w:noVBand="1"/>
+            </w:tblPr>
+            <w:tblGrid>
+              <w:gridCol w:w="6058"/>
+            </w:tblGrid>
+            <w:tr>
+              <w:trPr>
+                <w:tblCellSpacing w:w="15" w:type="dxa"/>
+              </w:trPr>
+              <w:tc>
+                <w:tcPr>
+                  <w:tcW w:w="0" w:type="auto"/>
+                  <w:vAlign w:val="center"/>
+                  <w:hideMark/>
+                </w:tcPr>
+                <w:p>
+                  <w:pPr>
+                    <w:spacing w:after="0" w:line="240" w:lineRule="auto"/>
+                    <w:rPr>
+                      <w:rFonts w:asciiTheme="majorHAnsi" w:eastAsia="Times New Roman" w:hAnsiTheme="majorHAnsi" w:cstheme="majorHAnsi"/>
+                      <w:sz w:val="19"/>
+                      <w:szCs w:val="19"/>
+                      <w:lang w:val="en-GB" w:eastAsia="en-GB"/>
+                    </w:rPr>
+                  </w:pPr>
+                  <w:r>
+                    <w:rPr>
+                      <w:rFonts w:asciiTheme="majorHAnsi" w:eastAsia="Times New Roman" w:hAnsiTheme="majorHAnsi" w:cstheme="majorHAnsi"/>
+                      <w:sz w:val="19"/>
+                      <w:szCs w:val="19"/>
+                      <w:lang w:val="en-GB" w:eastAsia="en-GB"/>
+                    </w:rPr>
+                    <w:t>The administrator is logged into the system and has administrative privileges.</w:t>
+                  </w:r>
+                </w:p>
+              </w:tc>
+            </w:tr>
+          </w:tbl>
+          <w:p>
+            <w:pPr>
+              <w:spacing w:line="259" w:lineRule="auto"/>
+            </w:pPr>
+          </w:p>
         </w:tc>
       </w:tr>
       <w:tr>
@@ -13955,36 +14290,72 @@
             <w:r>
               <w:rPr>
                 <w:sz w:val="19"/>
-              </w:rPr>
-              <w:t>1. The administrator logs into the system.</w:t>
+                <w:lang w:val="en-DE"/>
+              </w:rPr>
+              <w:t>1</w:t>
+            </w:r>
+            <w:r>
+              <w:rPr>
+                <w:sz w:val="19"/>
+              </w:rPr>
+              <w:t>. The administrator reviews flagged or reported listings.</w:t>
             </w:r>
             <w:r>
               <w:rPr>
                 <w:sz w:val="19"/>
               </w:rPr>
               <w:br/>
-              <w:t>2. The administrator reviews flagged or reported listings.</w:t>
+            </w:r>
+            <w:r>
+              <w:rPr>
+                <w:sz w:val="19"/>
+                <w:lang w:val="en-DE"/>
+              </w:rPr>
+              <w:t>2</w:t>
+            </w:r>
+            <w:r>
+              <w:rPr>
+                <w:sz w:val="19"/>
+              </w:rPr>
+              <w:t>. The administrator selects a listing.</w:t>
             </w:r>
             <w:r>
               <w:rPr>
                 <w:sz w:val="19"/>
               </w:rPr>
               <w:br/>
-              <w:t>3. The administrator selects a listing.</w:t>
+            </w:r>
+            <w:r>
+              <w:rPr>
+                <w:sz w:val="19"/>
+                <w:lang w:val="en-DE"/>
+              </w:rPr>
+              <w:t>3</w:t>
+            </w:r>
+            <w:r>
+              <w:rPr>
+                <w:sz w:val="19"/>
+              </w:rPr>
+              <w:t>. The administrator removes or disables the listing.</w:t>
             </w:r>
             <w:r>
               <w:rPr>
                 <w:sz w:val="19"/>
               </w:rPr>
               <w:br/>
-              <w:t>4. The administrator removes or disables the listing.</w:t>
-            </w:r>
-            <w:r>
-              <w:rPr>
-                <w:sz w:val="19"/>
-              </w:rPr>
-              <w:br/>
-              <w:t>5. The system records the action.</w:t>
+            </w:r>
+            <w:r>
+              <w:rPr>
+                <w:sz w:val="19"/>
+                <w:lang w:val="en-DE"/>
+              </w:rPr>
+              <w:t>4</w:t>
+            </w:r>
+            <w:r>
+              <w:rPr>
+                <w:sz w:val="19"/>
+              </w:rPr>
+              <w:t>. The system records the action.</w:t>
             </w:r>
           </w:p>
         </w:tc>
@@ -14595,8 +14966,9 @@
                 <w:rFonts w:asciiTheme="majorHAnsi" w:hAnsiTheme="majorHAnsi" w:cstheme="majorHAnsi"/>
                 <w:sz w:val="19"/>
                 <w:szCs w:val="19"/>
-              </w:rPr>
-              <w:t xml:space="preserve">1. The administrator logs into the system. </w:t>
+                <w:lang w:val="en-DE"/>
+              </w:rPr>
+              <w:t>1</w:t>
             </w:r>
             <w:r>
               <w:rPr>
@@ -14604,44 +14976,107 @@
                 <w:sz w:val="19"/>
                 <w:szCs w:val="19"/>
               </w:rPr>
+              <w:t xml:space="preserve">. The administrator accesses the admin dashboard. </w:t>
+            </w:r>
+            <w:r>
+              <w:rPr>
+                <w:rFonts w:asciiTheme="majorHAnsi" w:hAnsiTheme="majorHAnsi" w:cstheme="majorHAnsi"/>
+                <w:sz w:val="19"/>
+                <w:szCs w:val="19"/>
+              </w:rPr>
               <w:br/>
-              <w:t xml:space="preserve">2. The administrator accesses the admin dashboard. </w:t>
             </w:r>
             <w:r>
               <w:rPr>
                 <w:rFonts w:asciiTheme="majorHAnsi" w:hAnsiTheme="majorHAnsi" w:cstheme="majorHAnsi"/>
                 <w:sz w:val="19"/>
                 <w:szCs w:val="19"/>
+                <w:lang w:val="en-DE"/>
+              </w:rPr>
+              <w:t>2</w:t>
+            </w:r>
+            <w:r>
+              <w:rPr>
+                <w:rFonts w:asciiTheme="majorHAnsi" w:hAnsiTheme="majorHAnsi" w:cstheme="majorHAnsi"/>
+                <w:sz w:val="19"/>
+                <w:szCs w:val="19"/>
+              </w:rPr>
+              <w:t xml:space="preserve">. The administrator selects the dispute management or system settings option. </w:t>
+            </w:r>
+            <w:r>
+              <w:rPr>
+                <w:rFonts w:asciiTheme="majorHAnsi" w:hAnsiTheme="majorHAnsi" w:cstheme="majorHAnsi"/>
+                <w:sz w:val="19"/>
+                <w:szCs w:val="19"/>
               </w:rPr>
               <w:br/>
-              <w:t xml:space="preserve">3. The administrator selects the dispute management or system settings option. </w:t>
             </w:r>
             <w:r>
               <w:rPr>
                 <w:rFonts w:asciiTheme="majorHAnsi" w:hAnsiTheme="majorHAnsi" w:cstheme="majorHAnsi"/>
                 <w:sz w:val="19"/>
                 <w:szCs w:val="19"/>
+                <w:lang w:val="en-DE"/>
+              </w:rPr>
+              <w:t>3</w:t>
+            </w:r>
+            <w:r>
+              <w:rPr>
+                <w:rFonts w:asciiTheme="majorHAnsi" w:hAnsiTheme="majorHAnsi" w:cstheme="majorHAnsi"/>
+                <w:sz w:val="19"/>
+                <w:szCs w:val="19"/>
+              </w:rPr>
+              <w:t xml:space="preserve">. The administrator reviews disputes submitted by users or views current system settings. </w:t>
+            </w:r>
+            <w:r>
+              <w:rPr>
+                <w:rFonts w:asciiTheme="majorHAnsi" w:hAnsiTheme="majorHAnsi" w:cstheme="majorHAnsi"/>
+                <w:sz w:val="19"/>
+                <w:szCs w:val="19"/>
               </w:rPr>
               <w:br/>
-              <w:t xml:space="preserve">4. The administrator reviews disputes submitted by users or views current system settings. </w:t>
             </w:r>
             <w:r>
               <w:rPr>
                 <w:rFonts w:asciiTheme="majorHAnsi" w:hAnsiTheme="majorHAnsi" w:cstheme="majorHAnsi"/>
                 <w:sz w:val="19"/>
                 <w:szCs w:val="19"/>
+                <w:lang w:val="en-DE"/>
+              </w:rPr>
+              <w:t>4</w:t>
+            </w:r>
+            <w:r>
+              <w:rPr>
+                <w:rFonts w:asciiTheme="majorHAnsi" w:hAnsiTheme="majorHAnsi" w:cstheme="majorHAnsi"/>
+                <w:sz w:val="19"/>
+                <w:szCs w:val="19"/>
+              </w:rPr>
+              <w:t xml:space="preserve">. The administrator updates dispute status or modifies the required system settings. </w:t>
+            </w:r>
+            <w:r>
+              <w:rPr>
+                <w:rFonts w:asciiTheme="majorHAnsi" w:hAnsiTheme="majorHAnsi" w:cstheme="majorHAnsi"/>
+                <w:sz w:val="19"/>
+                <w:szCs w:val="19"/>
               </w:rPr>
               <w:br/>
-              <w:t xml:space="preserve">5. The administrator updates dispute status or modifies the required system settings. </w:t>
             </w:r>
             <w:r>
               <w:rPr>
                 <w:rFonts w:asciiTheme="majorHAnsi" w:hAnsiTheme="majorHAnsi" w:cstheme="majorHAnsi"/>
                 <w:sz w:val="19"/>
                 <w:szCs w:val="19"/>
-              </w:rPr>
-              <w:br/>
-              <w:t>6. The system saves the changes made by the administrator.</w:t>
+                <w:lang w:val="en-DE"/>
+              </w:rPr>
+              <w:t>5</w:t>
+            </w:r>
+            <w:r>
+              <w:rPr>
+                <w:rFonts w:asciiTheme="majorHAnsi" w:hAnsiTheme="majorHAnsi" w:cstheme="majorHAnsi"/>
+                <w:sz w:val="19"/>
+                <w:szCs w:val="19"/>
+              </w:rPr>
+              <w:t>. The system saves the changes made by the administrator.</w:t>
             </w:r>
           </w:p>
         </w:tc>
@@ -15153,6 +15588,60 @@
               <w:t>The actor is authenticated when the function requires account access, and the relevant page or module is available to the actor.</w:t>
             </w:r>
           </w:p>
+          <w:tbl>
+            <w:tblPr>
+              <w:tblW w:w="0" w:type="auto"/>
+              <w:tblCellSpacing w:w="15" w:type="dxa"/>
+              <w:tblCellMar>
+                <w:top w:w="15" w:type="dxa"/>
+                <w:left w:w="15" w:type="dxa"/>
+                <w:bottom w:w="15" w:type="dxa"/>
+                <w:right w:w="15" w:type="dxa"/>
+              </w:tblCellMar>
+              <w:tblLook w:val="04A0" w:firstRow="1" w:lastRow="0" w:firstColumn="1" w:lastColumn="0" w:noHBand="0" w:noVBand="1"/>
+            </w:tblPr>
+            <w:tblGrid>
+              <w:gridCol w:w="6058"/>
+            </w:tblGrid>
+            <w:tr>
+              <w:trPr>
+                <w:tblCellSpacing w:w="15" w:type="dxa"/>
+              </w:trPr>
+              <w:tc>
+                <w:tcPr>
+                  <w:tcW w:w="0" w:type="auto"/>
+                  <w:vAlign w:val="center"/>
+                  <w:hideMark/>
+                </w:tcPr>
+                <w:p>
+                  <w:pPr>
+                    <w:spacing w:after="0" w:line="240" w:lineRule="auto"/>
+                    <w:rPr>
+                      <w:rFonts w:asciiTheme="majorHAnsi" w:eastAsia="Times New Roman" w:hAnsiTheme="majorHAnsi" w:cstheme="majorHAnsi"/>
+                      <w:sz w:val="19"/>
+                      <w:szCs w:val="19"/>
+                      <w:lang w:val="en-GB" w:eastAsia="en-GB"/>
+                    </w:rPr>
+                  </w:pPr>
+                  <w:r>
+                    <w:rPr>
+                      <w:rFonts w:asciiTheme="majorHAnsi" w:eastAsia="Times New Roman" w:hAnsiTheme="majorHAnsi" w:cstheme="majorHAnsi"/>
+                      <w:sz w:val="19"/>
+                      <w:szCs w:val="19"/>
+                      <w:lang w:val="en-GB" w:eastAsia="en-GB"/>
+                    </w:rPr>
+                    <w:lastRenderedPageBreak/>
+                    <w:t>The administrator is logged into the system and has administrative privileges.</w:t>
+                  </w:r>
+                </w:p>
+              </w:tc>
+            </w:tr>
+          </w:tbl>
+          <w:p>
+            <w:pPr>
+              <w:spacing w:line="259" w:lineRule="auto"/>
+            </w:pPr>
+          </w:p>
         </w:tc>
       </w:tr>
       <w:tr>
@@ -15203,36 +15692,72 @@
             <w:r>
               <w:rPr>
                 <w:sz w:val="19"/>
-              </w:rPr>
-              <w:t>1. The administrator logs into the system.</w:t>
+                <w:lang w:val="en-DE"/>
+              </w:rPr>
+              <w:t>1</w:t>
+            </w:r>
+            <w:r>
+              <w:rPr>
+                <w:sz w:val="19"/>
+              </w:rPr>
+              <w:t>. The administrator opens user management.</w:t>
             </w:r>
             <w:r>
               <w:rPr>
                 <w:sz w:val="19"/>
               </w:rPr>
               <w:br/>
-              <w:t>2. The administrator opens user management.</w:t>
+            </w:r>
+            <w:r>
+              <w:rPr>
+                <w:sz w:val="19"/>
+                <w:lang w:val="en-DE"/>
+              </w:rPr>
+              <w:t>2</w:t>
+            </w:r>
+            <w:r>
+              <w:rPr>
+                <w:sz w:val="19"/>
+              </w:rPr>
+              <w:t>. The administrator selects a suspended or inactive account.</w:t>
             </w:r>
             <w:r>
               <w:rPr>
                 <w:sz w:val="19"/>
               </w:rPr>
               <w:br/>
-              <w:t>3. The administrator selects a suspended or inactive account.</w:t>
+            </w:r>
+            <w:r>
+              <w:rPr>
+                <w:sz w:val="19"/>
+                <w:lang w:val="en-DE"/>
+              </w:rPr>
+              <w:t>3</w:t>
+            </w:r>
+            <w:r>
+              <w:rPr>
+                <w:sz w:val="19"/>
+              </w:rPr>
+              <w:t>. The administrator chooses Restore.</w:t>
             </w:r>
             <w:r>
               <w:rPr>
                 <w:sz w:val="19"/>
               </w:rPr>
               <w:br/>
-              <w:t>4. The administrator chooses Restore.</w:t>
-            </w:r>
-            <w:r>
-              <w:rPr>
-                <w:sz w:val="19"/>
-              </w:rPr>
-              <w:br/>
-              <w:t>5. The system updates the account status and confirms the action.</w:t>
+            </w:r>
+            <w:r>
+              <w:rPr>
+                <w:sz w:val="19"/>
+                <w:lang w:val="en-DE"/>
+              </w:rPr>
+              <w:t>4</w:t>
+            </w:r>
+            <w:r>
+              <w:rPr>
+                <w:sz w:val="19"/>
+              </w:rPr>
+              <w:t>. The system updates the account status and confirms the action.</w:t>
             </w:r>
           </w:p>
         </w:tc>
@@ -15633,6 +16158,59 @@
               <w:t>The actor is authenticated when the function requires account access, and the relevant page or module is available to the actor.</w:t>
             </w:r>
           </w:p>
+          <w:tbl>
+            <w:tblPr>
+              <w:tblW w:w="0" w:type="auto"/>
+              <w:tblCellSpacing w:w="15" w:type="dxa"/>
+              <w:tblCellMar>
+                <w:top w:w="15" w:type="dxa"/>
+                <w:left w:w="15" w:type="dxa"/>
+                <w:bottom w:w="15" w:type="dxa"/>
+                <w:right w:w="15" w:type="dxa"/>
+              </w:tblCellMar>
+              <w:tblLook w:val="04A0" w:firstRow="1" w:lastRow="0" w:firstColumn="1" w:lastColumn="0" w:noHBand="0" w:noVBand="1"/>
+            </w:tblPr>
+            <w:tblGrid>
+              <w:gridCol w:w="6058"/>
+            </w:tblGrid>
+            <w:tr>
+              <w:trPr>
+                <w:tblCellSpacing w:w="15" w:type="dxa"/>
+              </w:trPr>
+              <w:tc>
+                <w:tcPr>
+                  <w:tcW w:w="0" w:type="auto"/>
+                  <w:vAlign w:val="center"/>
+                  <w:hideMark/>
+                </w:tcPr>
+                <w:p>
+                  <w:pPr>
+                    <w:spacing w:after="0" w:line="240" w:lineRule="auto"/>
+                    <w:rPr>
+                      <w:rFonts w:asciiTheme="majorHAnsi" w:eastAsia="Times New Roman" w:hAnsiTheme="majorHAnsi" w:cstheme="majorHAnsi"/>
+                      <w:sz w:val="19"/>
+                      <w:szCs w:val="19"/>
+                      <w:lang w:val="en-GB" w:eastAsia="en-GB"/>
+                    </w:rPr>
+                  </w:pPr>
+                  <w:r>
+                    <w:rPr>
+                      <w:rFonts w:asciiTheme="majorHAnsi" w:eastAsia="Times New Roman" w:hAnsiTheme="majorHAnsi" w:cstheme="majorHAnsi"/>
+                      <w:sz w:val="19"/>
+                      <w:szCs w:val="19"/>
+                      <w:lang w:val="en-GB" w:eastAsia="en-GB"/>
+                    </w:rPr>
+                    <w:t>The administrator is logged into the system and has administrative privileges.</w:t>
+                  </w:r>
+                </w:p>
+              </w:tc>
+            </w:tr>
+          </w:tbl>
+          <w:p>
+            <w:pPr>
+              <w:spacing w:line="259" w:lineRule="auto"/>
+            </w:pPr>
+          </w:p>
         </w:tc>
       </w:tr>
       <w:tr>
@@ -15682,50 +16260,110 @@
             <w:r>
               <w:rPr>
                 <w:sz w:val="19"/>
-              </w:rPr>
-              <w:t>1. The administrator logs into the system.</w:t>
+                <w:lang w:val="en-DE"/>
+              </w:rPr>
+              <w:t>1</w:t>
+            </w:r>
+            <w:r>
+              <w:rPr>
+                <w:sz w:val="19"/>
+              </w:rPr>
+              <w:t>. The administrator opens user management.</w:t>
             </w:r>
             <w:r>
               <w:rPr>
                 <w:sz w:val="19"/>
               </w:rPr>
               <w:br/>
-              <w:t>2. The administrator opens user management.</w:t>
+            </w:r>
+            <w:r>
+              <w:rPr>
+                <w:sz w:val="19"/>
+                <w:lang w:val="en-DE"/>
+              </w:rPr>
+              <w:t>2</w:t>
+            </w:r>
+            <w:r>
+              <w:rPr>
+                <w:sz w:val="19"/>
+              </w:rPr>
+              <w:t>. The administrator selects a user account.</w:t>
             </w:r>
             <w:r>
               <w:rPr>
                 <w:sz w:val="19"/>
               </w:rPr>
               <w:br/>
-              <w:t>3. The administrator selects a user account.</w:t>
+            </w:r>
+            <w:r>
+              <w:rPr>
+                <w:sz w:val="19"/>
+                <w:lang w:val="en-DE"/>
+              </w:rPr>
+              <w:t>3</w:t>
+            </w:r>
+            <w:r>
+              <w:rPr>
+                <w:sz w:val="19"/>
+              </w:rPr>
+              <w:t>. The administrator chooses Suspend.</w:t>
             </w:r>
             <w:r>
               <w:rPr>
                 <w:sz w:val="19"/>
               </w:rPr>
               <w:br/>
-              <w:t>4. The administrator chooses Suspend.</w:t>
+            </w:r>
+            <w:r>
+              <w:rPr>
+                <w:sz w:val="19"/>
+                <w:lang w:val="en-DE"/>
+              </w:rPr>
+              <w:t>4</w:t>
+            </w:r>
+            <w:r>
+              <w:rPr>
+                <w:sz w:val="19"/>
+              </w:rPr>
+              <w:t>. The system asks for confirmation or a reason.</w:t>
             </w:r>
             <w:r>
               <w:rPr>
                 <w:sz w:val="19"/>
               </w:rPr>
               <w:br/>
-              <w:t>5. The system asks for confirmation or a reason.</w:t>
+            </w:r>
+            <w:r>
+              <w:rPr>
+                <w:sz w:val="19"/>
+                <w:lang w:val="en-DE"/>
+              </w:rPr>
+              <w:t>5</w:t>
+            </w:r>
+            <w:r>
+              <w:rPr>
+                <w:sz w:val="19"/>
+              </w:rPr>
+              <w:t>. The administrator confirms the suspension.</w:t>
             </w:r>
             <w:r>
               <w:rPr>
                 <w:sz w:val="19"/>
               </w:rPr>
               <w:br/>
-              <w:t>6. The administrator confirms the suspension.</w:t>
-            </w:r>
-            <w:r>
-              <w:rPr>
-                <w:sz w:val="19"/>
-              </w:rPr>
-              <w:br/>
-              <w:t>7. The system updates the account status.</w:t>
+            </w:r>
+            <w:r>
+              <w:rPr>
+                <w:sz w:val="19"/>
+                <w:lang w:val="en-DE"/>
+              </w:rPr>
+              <w:t>6</w:t>
+            </w:r>
+            <w:r>
+              <w:rPr>
+                <w:sz w:val="19"/>
+              </w:rPr>
+              <w:t>. The system updates the account status.</w:t>
             </w:r>
           </w:p>
         </w:tc>
@@ -16187,6 +16825,63 @@
               <w:t>The administrator is logged into the system and there are pending property listings awaiting approval.</w:t>
             </w:r>
           </w:p>
+          <w:tbl>
+            <w:tblPr>
+              <w:tblW w:w="0" w:type="auto"/>
+              <w:tblCellSpacing w:w="15" w:type="dxa"/>
+              <w:tblCellMar>
+                <w:top w:w="15" w:type="dxa"/>
+                <w:left w:w="15" w:type="dxa"/>
+                <w:bottom w:w="15" w:type="dxa"/>
+                <w:right w:w="15" w:type="dxa"/>
+              </w:tblCellMar>
+              <w:tblLook w:val="04A0" w:firstRow="1" w:lastRow="0" w:firstColumn="1" w:lastColumn="0" w:noHBand="0" w:noVBand="1"/>
+            </w:tblPr>
+            <w:tblGrid>
+              <w:gridCol w:w="6058"/>
+            </w:tblGrid>
+            <w:tr>
+              <w:trPr>
+                <w:tblCellSpacing w:w="15" w:type="dxa"/>
+              </w:trPr>
+              <w:tc>
+                <w:tcPr>
+                  <w:tcW w:w="0" w:type="auto"/>
+                  <w:vAlign w:val="center"/>
+                  <w:hideMark/>
+                </w:tcPr>
+                <w:p>
+                  <w:pPr>
+                    <w:spacing w:after="0" w:line="240" w:lineRule="auto"/>
+                    <w:rPr>
+                      <w:rFonts w:asciiTheme="majorHAnsi" w:eastAsia="Times New Roman" w:hAnsiTheme="majorHAnsi" w:cstheme="majorHAnsi"/>
+                      <w:sz w:val="19"/>
+                      <w:szCs w:val="19"/>
+                      <w:lang w:val="en-GB" w:eastAsia="en-GB"/>
+                    </w:rPr>
+                  </w:pPr>
+                  <w:r>
+                    <w:rPr>
+                      <w:rFonts w:asciiTheme="majorHAnsi" w:eastAsia="Times New Roman" w:hAnsiTheme="majorHAnsi" w:cstheme="majorHAnsi"/>
+                      <w:sz w:val="19"/>
+                      <w:szCs w:val="19"/>
+                      <w:lang w:val="en-GB" w:eastAsia="en-GB"/>
+                    </w:rPr>
+                    <w:t>The administrator is logged into the system and has administrative privileges.</w:t>
+                  </w:r>
+                </w:p>
+              </w:tc>
+            </w:tr>
+          </w:tbl>
+          <w:p>
+            <w:pPr>
+              <w:spacing w:line="259" w:lineRule="auto"/>
+              <w:rPr>
+                <w:sz w:val="19"/>
+                <w:szCs w:val="19"/>
+              </w:rPr>
+            </w:pPr>
+          </w:p>
         </w:tc>
       </w:tr>
       <w:tr>
@@ -16241,8 +16936,16 @@
               <w:rPr>
                 <w:sz w:val="19"/>
                 <w:szCs w:val="19"/>
-              </w:rPr>
-              <w:t xml:space="preserve">1. The administrator logs into the system. </w:t>
+                <w:lang w:val="en-DE"/>
+              </w:rPr>
+              <w:t>1</w:t>
+            </w:r>
+            <w:r>
+              <w:rPr>
+                <w:sz w:val="19"/>
+                <w:szCs w:val="19"/>
+              </w:rPr>
+              <w:t xml:space="preserve">. The administrator accesses the admin dashboard. </w:t>
             </w:r>
             <w:r>
               <w:rPr>
@@ -16250,7 +16953,21 @@
                 <w:szCs w:val="19"/>
               </w:rPr>
               <w:br/>
-              <w:t xml:space="preserve">2. The administrator accesses the admin dashboard. </w:t>
+            </w:r>
+            <w:r>
+              <w:rPr>
+                <w:sz w:val="19"/>
+                <w:szCs w:val="19"/>
+                <w:lang w:val="en-DE"/>
+              </w:rPr>
+              <w:t>2</w:t>
+            </w:r>
+            <w:r>
+              <w:rPr>
+                <w:sz w:val="19"/>
+                <w:szCs w:val="19"/>
+              </w:rPr>
+              <w:t xml:space="preserve">. The administrator selects the pending property listings section. </w:t>
             </w:r>
             <w:r>
               <w:rPr>
@@ -16258,7 +16975,21 @@
                 <w:szCs w:val="19"/>
               </w:rPr>
               <w:br/>
-              <w:t xml:space="preserve">3. The administrator selects the pending property listings section. </w:t>
+            </w:r>
+            <w:r>
+              <w:rPr>
+                <w:sz w:val="19"/>
+                <w:szCs w:val="19"/>
+                <w:lang w:val="en-DE"/>
+              </w:rPr>
+              <w:t>3</w:t>
+            </w:r>
+            <w:r>
+              <w:rPr>
+                <w:sz w:val="19"/>
+                <w:szCs w:val="19"/>
+              </w:rPr>
+              <w:t xml:space="preserve">. The system displays newly submitted property listings awaiting verification. </w:t>
             </w:r>
             <w:r>
               <w:rPr>
@@ -16266,7 +16997,21 @@
                 <w:szCs w:val="19"/>
               </w:rPr>
               <w:br/>
-              <w:t xml:space="preserve">4. The system displays newly submitted property listings awaiting verification. </w:t>
+            </w:r>
+            <w:r>
+              <w:rPr>
+                <w:sz w:val="19"/>
+                <w:szCs w:val="19"/>
+                <w:lang w:val="en-DE"/>
+              </w:rPr>
+              <w:t>4</w:t>
+            </w:r>
+            <w:r>
+              <w:rPr>
+                <w:sz w:val="19"/>
+                <w:szCs w:val="19"/>
+              </w:rPr>
+              <w:t xml:space="preserve">. The administrator reviews the property details and uploaded information. </w:t>
             </w:r>
             <w:r>
               <w:rPr>
@@ -16274,7 +17019,22 @@
                 <w:szCs w:val="19"/>
               </w:rPr>
               <w:br/>
-              <w:t xml:space="preserve">5. The administrator reviews the property details and uploaded information. </w:t>
+            </w:r>
+            <w:r>
+              <w:rPr>
+                <w:sz w:val="19"/>
+                <w:szCs w:val="19"/>
+                <w:lang w:val="en-DE"/>
+              </w:rPr>
+              <w:lastRenderedPageBreak/>
+              <w:t>5</w:t>
+            </w:r>
+            <w:r>
+              <w:rPr>
+                <w:sz w:val="19"/>
+                <w:szCs w:val="19"/>
+              </w:rPr>
+              <w:t xml:space="preserve">. The administrator approves the listing. </w:t>
             </w:r>
             <w:r>
               <w:rPr>
@@ -16282,15 +17042,21 @@
                 <w:szCs w:val="19"/>
               </w:rPr>
               <w:br/>
-              <w:t xml:space="preserve">6. The administrator approves the listing. </w:t>
-            </w:r>
-            <w:r>
-              <w:rPr>
-                <w:sz w:val="19"/>
-                <w:szCs w:val="19"/>
-              </w:rPr>
-              <w:br/>
-              <w:t>7. The system publishes the approved property listing.</w:t>
+            </w:r>
+            <w:r>
+              <w:rPr>
+                <w:sz w:val="19"/>
+                <w:szCs w:val="19"/>
+                <w:lang w:val="en-DE"/>
+              </w:rPr>
+              <w:t>6</w:t>
+            </w:r>
+            <w:r>
+              <w:rPr>
+                <w:sz w:val="19"/>
+                <w:szCs w:val="19"/>
+              </w:rPr>
+              <w:t>. The system publishes the approved property listing.</w:t>
             </w:r>
           </w:p>
         </w:tc>
@@ -16779,33 +17545,75 @@
           <w:p>
             <w:pPr>
               <w:spacing w:line="259" w:lineRule="auto"/>
-            </w:pPr>
-            <w:r>
-              <w:rPr>
-                <w:sz w:val="19"/>
+              <w:rPr>
+                <w:sz w:val="19"/>
+                <w:szCs w:val="19"/>
+                <w:lang w:val="en-DE"/>
+              </w:rPr>
+            </w:pPr>
+            <w:r>
+              <w:rPr>
+                <w:sz w:val="19"/>
+                <w:szCs w:val="19"/>
               </w:rPr>
               <w:t>1. The manager logs into the system.</w:t>
             </w:r>
             <w:r>
               <w:rPr>
                 <w:sz w:val="19"/>
+                <w:szCs w:val="19"/>
               </w:rPr>
               <w:br/>
-              <w:t>2. The manager opens the rental requests overview.</w:t>
-            </w:r>
-            <w:r>
-              <w:rPr>
-                <w:sz w:val="19"/>
+              <w:t xml:space="preserve">2. The manager </w:t>
+            </w:r>
+            <w:r>
+              <w:rPr>
+                <w:sz w:val="19"/>
+                <w:szCs w:val="19"/>
+                <w:lang w:val="en-DE"/>
+              </w:rPr>
+              <w:t>views</w:t>
+            </w:r>
+            <w:r>
+              <w:rPr>
+                <w:sz w:val="19"/>
+                <w:szCs w:val="19"/>
+              </w:rPr>
+              <w:t xml:space="preserve"> the rental requests.</w:t>
+            </w:r>
+            <w:r>
+              <w:rPr>
+                <w:sz w:val="19"/>
+                <w:szCs w:val="19"/>
               </w:rPr>
               <w:br/>
-              <w:t>3. The system retrieves request data and statuses.</w:t>
-            </w:r>
-            <w:r>
-              <w:rPr>
-                <w:sz w:val="19"/>
-              </w:rPr>
-              <w:br/>
-              <w:t>4. The system displays the request information for monitoring.</w:t>
+              <w:t xml:space="preserve">3. </w:t>
+            </w:r>
+            <w:r>
+              <w:rPr>
+                <w:sz w:val="19"/>
+                <w:szCs w:val="19"/>
+                <w:lang w:val="en-DE"/>
+              </w:rPr>
+              <w:t>The manager reviews requests.</w:t>
+            </w:r>
+          </w:p>
+          <w:p>
+            <w:pPr>
+              <w:spacing w:line="259" w:lineRule="auto"/>
+              <w:rPr>
+                <w:sz w:val="19"/>
+                <w:szCs w:val="19"/>
+                <w:lang w:val="en-DE"/>
+              </w:rPr>
+            </w:pPr>
+            <w:r>
+              <w:rPr>
+                <w:sz w:val="19"/>
+                <w:szCs w:val="19"/>
+                <w:lang w:val="en-DE"/>
+              </w:rPr>
+              <w:t>4. The manager approves or rejects the request</w:t>
             </w:r>
           </w:p>
         </w:tc>
@@ -16853,12 +17661,22 @@
           <w:p>
             <w:pPr>
               <w:spacing w:line="259" w:lineRule="auto"/>
-            </w:pPr>
-            <w:r>
-              <w:rPr>
-                <w:sz w:val="19"/>
-              </w:rPr>
-              <w:t>1. If there are no requests for the selected period, the system shows an empty-results message.</w:t>
+              <w:rPr>
+                <w:lang w:val="en-DE"/>
+              </w:rPr>
+            </w:pPr>
+            <w:r>
+              <w:rPr>
+                <w:sz w:val="19"/>
+              </w:rPr>
+              <w:t xml:space="preserve">1. If there are no requests </w:t>
+            </w:r>
+            <w:r>
+              <w:rPr>
+                <w:sz w:val="19"/>
+                <w:lang w:val="en-DE"/>
+              </w:rPr>
+              <w:t>pending, the manager waits for new requests.</w:t>
             </w:r>
           </w:p>
         </w:tc>
@@ -17029,7 +17847,15 @@
               <w:rPr>
                 <w:sz w:val="19"/>
               </w:rPr>
-              <w:t>Generate Management Reports</w:t>
+              <w:t>Generate Management Rep</w:t>
+            </w:r>
+            <w:bookmarkStart w:id="0" w:name="_GoBack"/>
+            <w:bookmarkEnd w:id="0"/>
+            <w:r>
+              <w:rPr>
+                <w:sz w:val="19"/>
+              </w:rPr>
+              <w:t>orts</w:t>
             </w:r>
           </w:p>
         </w:tc>
@@ -17989,7 +18815,7 @@
           <w:lang w:val="en-DE"/>
         </w:rPr>
       </w:pPr>
-      <w:bookmarkStart w:id="0" w:name="_Hlk225608306"/>
+      <w:bookmarkStart w:id="1" w:name="_Hlk225608306"/>
       <w:r>
         <w:rPr>
           <w:lang w:val="en-DE"/>
@@ -18042,7 +18868,7 @@
             </w:tcMar>
             <w:vAlign w:val="center"/>
           </w:tcPr>
-          <w:bookmarkEnd w:id="0"/>
+          <w:bookmarkEnd w:id="1"/>
           <w:p>
             <w:pPr>
               <w:spacing w:line="252" w:lineRule="auto"/>
@@ -18721,7 +19547,7 @@
         <w:pStyle w:val="Heading2"/>
         <w:spacing w:before="80" w:after="60" w:line="264" w:lineRule="auto"/>
       </w:pPr>
-      <w:bookmarkStart w:id="1" w:name="_Hlk225608330"/>
+      <w:bookmarkStart w:id="2" w:name="_Hlk225608330"/>
       <w:r>
         <w:rPr>
           <w:lang w:val="en-DE"/>
@@ -18768,7 +19594,7 @@
             </w:tcMar>
             <w:vAlign w:val="center"/>
           </w:tcPr>
-          <w:bookmarkEnd w:id="1"/>
+          <w:bookmarkEnd w:id="2"/>
           <w:p>
             <w:pPr>
               <w:spacing w:line="252" w:lineRule="auto"/>
@@ -19218,7 +20044,7 @@
         <w:pStyle w:val="Heading2"/>
         <w:spacing w:before="80" w:after="60" w:line="264" w:lineRule="auto"/>
       </w:pPr>
-      <w:bookmarkStart w:id="2" w:name="_Hlk225608347"/>
+      <w:bookmarkStart w:id="3" w:name="_Hlk225608347"/>
       <w:r>
         <w:rPr>
           <w:lang w:val="en-DE"/>
@@ -19265,7 +20091,7 @@
             </w:tcMar>
             <w:vAlign w:val="center"/>
           </w:tcPr>
-          <w:bookmarkEnd w:id="2"/>
+          <w:bookmarkEnd w:id="3"/>
           <w:p>
             <w:pPr>
               <w:spacing w:line="252" w:lineRule="auto"/>
@@ -19706,7 +20532,7 @@
         <w:pStyle w:val="Heading2"/>
         <w:spacing w:before="80" w:after="60" w:line="264" w:lineRule="auto"/>
       </w:pPr>
-      <w:bookmarkStart w:id="3" w:name="_Hlk225608364"/>
+      <w:bookmarkStart w:id="4" w:name="_Hlk225608364"/>
       <w:r>
         <w:rPr>
           <w:lang w:val="en-DE"/>
@@ -19744,7 +20570,7 @@
             </w:tcMar>
             <w:vAlign w:val="center"/>
           </w:tcPr>
-          <w:bookmarkEnd w:id="3"/>
+          <w:bookmarkEnd w:id="4"/>
           <w:p>
             <w:pPr>
               <w:spacing w:line="252" w:lineRule="auto"/>
@@ -20166,8 +20992,6 @@
               </w:rPr>
               <w:t xml:space="preserve">is asked </w:t>
             </w:r>
-            <w:bookmarkStart w:id="4" w:name="_GoBack"/>
-            <w:bookmarkEnd w:id="4"/>
             <w:r>
               <w:rPr>
                 <w:sz w:val="19"/>
@@ -37312,7 +38136,7 @@
 </file>
 
 <file path=customXml/itemProps1.xml><?xml version="1.0" encoding="utf-8"?>
-<ds:datastoreItem xmlns:ds="http://schemas.openxmlformats.org/officeDocument/2006/customXml" ds:itemID="{29E50A64-1B45-4826-899C-AAD852BFC188}">
+<ds:datastoreItem xmlns:ds="http://schemas.openxmlformats.org/officeDocument/2006/customXml" ds:itemID="{FAEE4D66-B3F7-4ADD-8022-20E939054248}">
   <ds:schemaRefs>
     <ds:schemaRef ds:uri="http://schemas.openxmlformats.org/officeDocument/2006/bibliography"/>
   </ds:schemaRefs>

</xml_diff>